<commit_message>
added hooks and pages and location setting
</commit_message>
<xml_diff>
--- a/tuto.docx
+++ b/tuto.docx
@@ -173,6 +173,57 @@
         <w:t>Setting page &amp; Hooks</w:t>
       </w:r>
     </w:p>
+    <w:p>
+      <w:pPr>
+        <w:jc w:val="center"/>
+        <w:rPr>
+          <w:b/>
+          <w:bCs/>
+          <w:color w:val="EE0000"/>
+        </w:rPr>
+      </w:pPr>
+    </w:p>
+    <w:p>
+      <w:r>
+        <w:t xml:space="preserve">In </w:t>
+      </w:r>
+      <w:r>
+        <w:rPr>
+          <w:b/>
+          <w:bCs/>
+        </w:rPr>
+        <w:t>Playwright Test</w:t>
+      </w:r>
+      <w:r>
+        <w:t xml:space="preserve">, </w:t>
+      </w:r>
+      <w:proofErr w:type="spellStart"/>
+      <w:proofErr w:type="gramStart"/>
+      <w:r>
+        <w:t>test.describe</w:t>
+      </w:r>
+      <w:proofErr w:type="spellEnd"/>
+      <w:proofErr w:type="gramEnd"/>
+      <w:r>
+        <w:t xml:space="preserve">() is used to </w:t>
+      </w:r>
+      <w:r>
+        <w:rPr>
+          <w:b/>
+          <w:bCs/>
+        </w:rPr>
+        <w:t>group related tests together</w:t>
+      </w:r>
+      <w:r>
+        <w:t xml:space="preserve"> into a logical block.</w:t>
+      </w:r>
+    </w:p>
+    <w:p>
+      <w:r>
+        <w:t>Think of it like a “folder” for tests inside your test file.</w:t>
+      </w:r>
+    </w:p>
+    <w:p/>
     <w:p>
       <w:pPr>
         <w:rPr>
@@ -917,7 +968,6 @@
   <w:style w:type="character" w:default="1" w:styleId="DefaultParagraphFont">
     <w:name w:val="Default Paragraph Font"/>
     <w:uiPriority w:val="1"/>
-    <w:semiHidden/>
     <w:unhideWhenUsed/>
   </w:style>
   <w:style w:type="table" w:default="1" w:styleId="TableNormal">

</xml_diff>